<commit_message>
[P4] tesis: lleva el word de la seccion 4.4 al apartado de mejora del analisis situacional
</commit_message>
<xml_diff>
--- a/resultados-prototipos/capitulo-4-4-resultados.docx
+++ b/resultados-prototipos/capitulo-4-4-resultados.docx
@@ -82,7 +82,16 @@
         <w:jc w:val="left"/>
       </w:pPr>
       <w:r>
-        <w:t xml:space="preserve">4.4.5 Síntesis de los resultados</w:t>
+        <w:t xml:space="preserve">4.4.5 Mejora del análisis situacional tras la aplicación de la metodología</w:t>
+      </w:r>
+    </w:p>
+    <w:p>
+      <w:pPr>
+        <w:spacing w:after="60" w:line="240" w:lineRule="auto"/>
+        <w:jc w:val="left"/>
+      </w:pPr>
+      <w:r>
+        <w:t xml:space="preserve">4.4.6 Síntesis de los resultados</w:t>
       </w:r>
     </w:p>
     <w:p>
@@ -100,7 +109,7 @@
     </w:p>
     <w:p>
       <w:r>
-        <w:t xml:space="preserve">La metodología Honeypot se aplica en dos ocasiones sobre una misma campaña de diez escenarios, cuyos resultados se presentan siguiendo el orden de ejecución y análisis establecido en la investigación. La exposición comienza con el resultado global de la aplicación, continúa con la descripción de las condiciones comunes de medición y desarrolla los resultados obtenidos por cada prototipo, para finalizar con la comparación entre ambos y la síntesis de los principales hallazgos. Esta organización permite examinar el comportamiento general de la metodología y profundizar en los resultados específicos que evidencian su funcionamiento y evolución.</w:t>
+        <w:t xml:space="preserve">La metodología Honeypot se aplica en dos ocasiones sobre una misma campaña de diez escenarios, cuyos resultados se presentan siguiendo el orden de ejecución y análisis establecido en la investigación. La exposición comienza con el resultado global de la aplicación, continúa con la descripción de las condiciones comunes de medición y desarrolla los resultados obtenidos por cada prototipo, para finalizar con la comparación entre ambos, la mejora del análisis situacional y la síntesis de los principales hallazgos. Esta organización permite examinar el comportamiento general de la metodología y profundizar en los resultados específicos que evidencian su funcionamiento y evolución.</w:t>
       </w:r>
     </w:p>
     <w:p>
@@ -1522,7 +1531,7 @@
         <w:ind w:firstLine="384"/>
       </w:pPr>
       <w:r>
-        <w:t xml:space="preserve">La Tabla 4 presenta los indicadores obtenidos durante esta primera aplicación y especifica el reporte de origen de cada dato, lo que permite mantener la relación entre los resultados y los registros generados por el laboratorio. El promedio de detección es de 41,598 segundos, con un valor mínimo de 0,141 segundos y un máximo de 260,108 segundos; además, siete de las nueve mediciones se encuentran por debajo de un minuto. En cuanto a la cobertura técnica, el inventario comprende diecisiete técnicas (técnicas del marco MITRE ATT&amp;CK, capítulo 1, sección 1.3.5) y el reporte declara diez técnicas detectadas, distribuidas en seis tácticas del mismo marco. La correspondencia normativa registra las cinco fases de ISO/IEC 27035-1 de 2023 (capítulo 1, sección 1.3.2) y la aplicación recoge tres lecciones aprendidas, que corresponden a la fase cinco del ciclo de gestión de incidentes considerado por la norma.</w:t>
+        <w:t>La Tabla 3 presenta los indicadores obtenidos durante esta primera aplicación y especifica el reporte de origen de cada dato, lo que permite mantener la relación entre los resultados y los registros generados por el laboratorio. El promedio de detección es de 41,598 segundos, con un valor mínimo de 0,141 segundos y un máximo de 260,108 segundos; además, siete de las nueve mediciones se encuentran por debajo de un minuto. En cuanto a la cobertura técnica, el inventario comprende diecisiete técnicas (técnicas del marco MITRE ATT&amp;CK, capítulo 1, sección 1.3.5) y el reporte declara diez técnicas detectadas, distribuidas en seis tácticas del mismo marco. La correspondencia normativa registra las cinco fases de ISO/IEC 27035-1 de 2023 (capítulo 1, sección 1.3.2) y la aplicación recoge tres lecciones aprendidas, que corresponden a la fase cinco del ciclo de gestión de incidentes considerado por la norma.</w:t>
       </w:r>
     </w:p>
     <w:p>
@@ -1539,7 +1548,7 @@
         <w:keepNext/>
       </w:pPr>
       <w:r>
-        <w:t xml:space="preserve">Tabla 4</w:t>
+        <w:t>Tabla 3</w:t>
       </w:r>
     </w:p>
     <w:p>
@@ -2480,7 +2489,7 @@
         <w:ind w:firstLine="384"/>
       </w:pPr>
       <w:r>
-        <w:t xml:space="preserve">La inspección visual muestra que las seis tácticas de la campaña presentan detección para todas las técnicas que les corresponden, de manera que la cobertura declarada por el reporte alcanza las diez técnicas repartidas entre seis tácticas y coincide con el indicador global de la Tabla 4. Esta organización permite identificar el comportamiento de la cobertura por táctica en la campaña y observar que ninguna de las técnicas que la integran queda sin una cobertura declarada en el reporte del laboratorio. La atribución temporal de un primer evento constituye un registro distinto, porque el escenario de exfiltración por nombres no produce tiempo de detección en el primer laboratorio, como muestran la Figura 6 y la Figura 8. Esa diferencia entre la cobertura declarada y la atribución instrumentada delimita la deficiencia concreta que el segundo laboratorio corrige, porque la incorporación de su sensor de red permite que el escenario de exfiltración por nombres alcance un tiempo de detección en la medición final.</w:t>
+        <w:t>La inspección visual muestra que las seis tácticas de la campaña presentan detección para todas las técnicas que les corresponden, de manera que la cobertura declarada por el reporte alcanza las diez técnicas repartidas entre seis tácticas y coincide con el indicador global de la Tabla 3. Esta organización permite identificar el comportamiento de la cobertura por táctica en la campaña y observar que ninguna de las técnicas que la integran queda sin una cobertura declarada en el reporte del laboratorio. La atribución temporal de un primer evento constituye un registro distinto, porque el escenario de exfiltración por nombres no produce tiempo de detección en el primer laboratorio, como muestran la Figura 6 y la Figura 8. Esa diferencia entre la cobertura declarada y la atribución instrumentada delimita la deficiencia concreta que el segundo laboratorio corrige, porque la incorporación de su sensor de red permite que el escenario de exfiltración por nombres alcance un tiempo de detección en la medición final.</w:t>
       </w:r>
     </w:p>
     <w:p>
@@ -2544,7 +2553,7 @@
         <w:ind w:firstLine="384"/>
       </w:pPr>
       <w:r>
-        <w:t xml:space="preserve">La revisión incorpora también la correspondencia documentada con las cinco fases de ISO/IEC 27035 y el registro de tres lecciones aprendidas, cuyos hallazgos sirven como referencia para el desarrollo del segundo prototipo. La cobertura técnica se presenta a partir de los reportes del laboratorio y del detalle representado en la Figura 7, que muestra la cobertura completa de las seis tácticas de la campaña, de manera que el gráfico y el indicador global de diez técnicas detectadas de diez de la Tabla 4 coinciden sin necesidad de contraste adicional. En conjunto, los resultados del primer prototipo establecen la referencia inicial para comparar la aplicación posterior de la metodología y analizar la evolución de los tiempos, la cobertura técnica y las lecciones aprendidas entre las dos implementaciones.</w:t>
+        <w:t>La revisión incorpora también la correspondencia documentada con las cinco fases de ISO/IEC 27035 y el registro de tres lecciones aprendidas, cuyos hallazgos sirven como referencia para el desarrollo del segundo prototipo. La cobertura técnica se presenta a partir de los reportes del laboratorio y del detalle representado en la Figura 7, que muestra la cobertura completa de las seis tácticas de la campaña, de manera que el gráfico y el indicador global de diez técnicas detectadas de diez de la Tabla 3 coinciden sin necesidad de contraste adicional. En conjunto, los resultados del primer prototipo establecen la referencia inicial para comparar la aplicación posterior de la metodología y analizar la evolución de los tiempos, la cobertura técnica y las lecciones aprendidas entre las dos implementaciones.</w:t>
       </w:r>
     </w:p>
     <w:p>
@@ -2587,7 +2596,7 @@
         <w:ind w:firstLine="384"/>
       </w:pPr>
       <w:r>
-        <w:t xml:space="preserve">La Tabla 5 presenta los indicadores del segundo prototipo en la vuelta inicial y en la medición final, con el propósito de comparar el resultado del ciclo de iteración sobre los mismos diez escenarios. La cobertura temporal pasa del 40 % al 100 % de la campaña; el tiempo medio de detección baja de 5,2155 a 2,0219 segundos; el percentil 95 desciende de 14,583 a 9,266 segundos. Las técnicas con fuente de detección crecen del 40 % al 100 %; las tácticas con fuente suben del 50 % al 100 %; las lecciones aprendidas registradas se duplican de siete a catorce. Los archivos con huella verificada y la calidad de la custodia se mantienen en 91 archivos y en 100 sobre 100 entre ambas vueltas, lo que confirma la estabilidad de la custodia a lo largo del ciclo de iteración.</w:t>
+        <w:t>La Tabla 4 presenta los indicadores del segundo prototipo en la vuelta inicial y en la medición final, con el propósito de comparar el resultado del ciclo de iteración sobre los mismos diez escenarios. La cobertura temporal pasa del 40 % al 100 % de la campaña; el tiempo medio de detección baja de 5,2155 a 2,0219 segundos; el percentil 95 desciende de 14,583 a 9,266 segundos. Las técnicas con fuente de detección crecen del 40 % al 100 %; las tácticas con fuente suben del 50 % al 100 %; las lecciones aprendidas registradas se duplican de siete a catorce. Los archivos con huella verificada y la calidad de la custodia se mantienen en 91 archivos y en 100 sobre 100 entre ambas vueltas, lo que confirma la estabilidad de la custodia a lo largo del ciclo de iteración.</w:t>
       </w:r>
     </w:p>
     <w:p>
@@ -2596,7 +2605,7 @@
         <w:keepNext/>
       </w:pPr>
       <w:r>
-        <w:t xml:space="preserve">Tabla 5</w:t>
+        <w:t>Tabla 4</w:t>
       </w:r>
     </w:p>
     <w:p>
@@ -3457,7 +3466,7 @@
         <w:ind w:firstLine="384"/>
       </w:pPr>
       <w:r>
-        <w:t xml:space="preserve">La cobertura técnica confirma esa lectura, dado que las técnicas y tácticas del marco MITRE ATT&amp;CK (capítulo 1, sección 1.3.5) identifican cada uno de los diez escenarios con fuente de detección en la medición final. El inventario del laboratorio cubre técnicas del marco cuya selección se acota al requisito RF-6 del capítulo 3 (sección 3.1.1); en la medición final, todas las técnicas de la campaña reciben fuente, lo que cierra la cobertura declarada en la Tabla 5.</w:t>
+        <w:t>La cobertura técnica confirma esa lectura, dado que las técnicas y tácticas del marco MITRE ATT&amp;CK (capítulo 1, sección 1.3.5) identifican cada uno de los diez escenarios con fuente de detección en la medición final. El inventario del laboratorio cubre técnicas del marco cuya selección se acota al requisito RF-6 del capítulo 3 (sección 3.1.1); en la medición final, todas las técnicas de la campaña reciben fuente, lo que cierra la cobertura declarada en la Tabla 4.</w:t>
       </w:r>
     </w:p>
     <w:p>
@@ -3877,7 +3886,7 @@
         <w:ind w:firstLine="384"/>
       </w:pPr>
       <w:r>
-        <w:t xml:space="preserve">El segundo prototipo establece así una segunda lectura del funcionamiento de la metodología sobre un entorno productivo real, con el inventario del señuelo y la composición de la campaña preservados entre vueltas. La comparación con el primer laboratorio se aborda en el apartado siguiente, mientras que las tres precisiones que el ciclo aporta sobre cobertura, custodia y registro de correcciones pasan a formar parte de la lectura conjunta del 4.4.5.</w:t>
+        <w:t xml:space="preserve">El segundo prototipo establece así una segunda lectura del funcionamiento de la metodología sobre un entorno productivo real, con el inventario del señuelo y la composición de la campaña preservados entre vueltas. La comparación con el primer laboratorio se aborda en el apartado siguiente, mientras que las tres precisiones que el ciclo aporta sobre cobertura, custodia y registro de correcciones pasan a formar parte de la lectura conjunta del 4.4.6.</w:t>
       </w:r>
     </w:p>
     <w:p>
@@ -3907,7 +3916,7 @@
         <w:ind w:firstLine="384"/>
       </w:pPr>
       <w:r>
-        <w:t xml:space="preserve">La comparación entre los dos prototipos se apoya en una campaña común de diez escenarios, diez técnicas y seis tácticas, de manera que la diferencia entre los tres momentos medidos provenga del instrumental y no de un cambio en la composición de la campaña. Los tres momentos corresponden al primer laboratorio, a la primera vuelta del segundo y a su medición final, de manera que la comparación conserve una base idéntica de actividades simuladas. La Tabla 6 reúne los indicadores de los tres momentos en una sola lectura, con lo que cada indicador conserve su denominador declarado y la comparación se establezca sobre la misma estructura de cuentas.</w:t>
+        <w:t>La comparación entre los dos prototipos se apoya en una campaña común de diez escenarios, diez técnicas y seis tácticas, de manera que la diferencia entre los tres momentos medidos provenga del instrumental y no de un cambio en la composición de la campaña. Los tres momentos corresponden al primer laboratorio, a la primera vuelta del segundo y a su medición final, de manera que la comparación conserve una base idéntica de actividades simuladas. La Tabla 5 reúne los indicadores de los tres momentos en una sola lectura, con lo que cada indicador conserve su denominador declarado y la comparación se establezca sobre la misma estructura de cuentas.</w:t>
       </w:r>
     </w:p>
     <w:p>
@@ -3924,7 +3933,7 @@
         <w:keepNext/>
       </w:pPr>
       <w:r>
-        <w:t xml:space="preserve">Tabla 6</w:t>
+        <w:t>Tabla 5</w:t>
       </w:r>
     </w:p>
     <w:p>
@@ -5033,7 +5042,7 @@
         <w:ind w:firstLine="384"/>
       </w:pPr>
       <w:r>
-        <w:t xml:space="preserve">La Tabla 7 presenta ese ciclo para el primer prototipo y la Tabla 8 lo completa para el segundo, de manera que cada laboratorio exponga su momento inicial, su momento final y el cambio que sostiene esa lectura. Esa salvedad acota la lectura de la comparación, porque el estado final del primer prototipo se observa en otro laboratorio y con una campaña de mayor cobertura, de manera que la diferencia entre los dos momentos sea atribuible a la corrección del instrumental y no al cambio de escenario. La comparación del Prototipo 2 no arrastra esa salvedad, porque sus dos vueltas comparten el mismo señuelo, la misma campaña de diez escenarios y el mismo instrumental de custodia, de manera que la variación se atribuya a las once correcciones de instrumental y a las tres mitigaciones documentadas.</w:t>
+        <w:t>La Tabla 6 presenta ese ciclo para el primer prototipo y la Tabla 7 lo completa para el segundo, de manera que cada laboratorio exponga su momento inicial, su momento final y el cambio que sostiene esa lectura. Esa salvedad acota la lectura de la comparación, porque el estado final del primer prototipo se observa en otro laboratorio y con una campaña de mayor cobertura, de manera que la diferencia entre los dos momentos sea atribuible a la corrección del instrumental y no al cambio de escenario. La comparación del Prototipo 2 no arrastra esa salvedad, porque sus dos vueltas comparten el mismo señuelo, la misma campaña de diez escenarios y el mismo instrumental de custodia, de manera que la variación se atribuya a las once correcciones de instrumental y a las tres mitigaciones documentadas.</w:t>
       </w:r>
     </w:p>
     <w:p>
@@ -5042,7 +5051,7 @@
         <w:keepNext/>
       </w:pPr>
       <w:r>
-        <w:t xml:space="preserve">Tabla 7</w:t>
+        <w:t>Tabla 6</w:t>
       </w:r>
     </w:p>
     <w:p>
@@ -5803,7 +5812,12 @@
         <w:t xml:space="preserve">Nota.</w:t>
       </w:r>
       <w:r>
-        <w:t xml:space="preserve"> El momento inicial del primer prototipo recoge la única ejecución disponible en el TaxFisco Research Lab, y el momento final verificado corresponde a la medición final del segundo laboratorio, en la que se aplican las correcciones que las tres lecciones de la primera campaña originan. La fila de correspondencia normativa cambia de fuente, porque el valor de cinco de cinco procede de la revisión manual de correspondencia del primer laboratorio y el valor de una de cinco del verificador automático que los tres momentos comparten. Los once indicadores reproducen los de la Tabla 6 con su denominador declarado.</w:t>
+        <w:t xml:space="preserve"> El momento inicial del primer prototipo recoge la única ejecución disponible en el TaxFisco Research Lab, y el momento final verificado corresponde a la medición final del segundo laboratorio, en la que se aplican las correcciones que las tres lecciones de la primera campaña originan. La fila de correspondencia normativa cambia de fuente, porque el valor de cinco de cinco procede de la revisión manual de correspondencia del primer laboratorio y el valor de una de cinco del verificador automático que los tres momentos comparten. Los once indicadores reproducen los de la Tabla 5 con su denominador declarado.</w:t>
+      </w:r>
+    </w:p>
+    <w:p>
+      <w:r>
+        <w:t xml:space="preserve">El resultado verificado mejora cuatro de los ocho indicadores del primer prototipo, de manera que la mejora se apoye en la cobertura de la campaña y en el registro de correcciones. Los escenarios con medición pasan del 90 % al 100 % y las lecciones resueltas del 21,43 % al 100 %, mientras que el indicador de detección subsegundo sube del 55,56 % al 70 % al ampliarse el conjunto medido. Tres indicadores se mantienen en su valor inicial, porque ningún escenario, ninguna técnica de la campaña ni ningún archivo de evidencia registra variación en ninguno de los dos momentos medidos. El eje de fases de ISO/IEC 27035 es la única excepción, porque el valor de cinco de cinco procede de la revisión manual de correspondencia del primer laboratorio y el de una de cinco del verificador automático que los tres momentos comparten, de manera que ese descenso no describa una pérdida de cobertura normativa.</w:t>
       </w:r>
     </w:p>
     <w:p>
@@ -5812,7 +5826,7 @@
         <w:keepNext/>
       </w:pPr>
       <w:r>
-        <w:t xml:space="preserve">Tabla 8</w:t>
+        <w:t>Tabla 7</w:t>
       </w:r>
     </w:p>
     <w:p>
@@ -6573,7 +6587,12 @@
         <w:t xml:space="preserve">Nota.</w:t>
       </w:r>
       <w:r>
-        <w:t xml:space="preserve"> Las dos vueltas comparten el mismo señuelo, la misma campaña de diez escenarios y el mismo instrumental de custodia, de manera que la variación de cada fila sea atribuible a las correcciones aplicadas y no a un cambio en la composición de la campaña. Los once indicadores reproducen los de la Tabla 6 con su denominador declarado.</w:t>
+        <w:t xml:space="preserve"> Las dos vueltas comparten el mismo señuelo, la misma campaña de diez escenarios y el mismo instrumental de custodia, de manera que la variación de cada fila sea atribuible a las correcciones aplicadas y no a un cambio en la composición de la campaña. Los once indicadores reproducen los de la Tabla 5 con su denominador declarado.</w:t>
+      </w:r>
+    </w:p>
+    <w:p>
+      <w:r>
+        <w:t xml:space="preserve">El resultado verificado mejora cinco de los ocho indicadores del segundo prototipo, de manera que la recuperación se aprecie en la cobertura de la campaña y en el registro de correcciones. Los escenarios con medición pasan del 40 % al 100 %, las técnicas del 40 % al 100 % y las tácticas del 50 % al 100 %, mientras que la detección subsegundo sube del 0 % al 70 %. Los tres indicadores que se mantienen corresponden a la custodia de la evidencia, porque la calidad verificada y el volumen de archivos con huella no cambian entre las dos vueltas. La lectura conjunta de los dos casos de estudio, con el perfil inicial y el perfil posterior sobre las mismas catorce dimensiones, se presenta en el apartado siguiente.</w:t>
       </w:r>
     </w:p>
     <w:p>
@@ -6581,7 +6600,199 @@
         <w:pStyle w:val="Ttulo1"/>
       </w:pPr>
       <w:r>
-        <w:t xml:space="preserve">4.4.5 Síntesis de los resultados</w:t>
+        <w:t xml:space="preserve">4.4.5 Mejora del análisis situacional tras la aplicación de la metodología</w:t>
+      </w:r>
+    </w:p>
+    <w:p>
+      <w:pPr>
+        <w:spacing w:after="120" w:line="240" w:lineRule="auto"/>
+        <w:jc w:val="left"/>
+      </w:pPr>
+      <w:r>
+        <w:rPr>
+          <w:color w:val="5A6878"/>
+          <w:sz w:val="22"/>
+          <w:szCs w:val="22"/>
+        </w:rPr>
+        <w:t xml:space="preserve">Lectura del diagnóstico inicial y del perfil posterior en los dos casos de estudio, sobre las catorce dimensiones del instrumento de diagnóstico.</w:t>
+      </w:r>
+    </w:p>
+    <w:p>
+      <w:r>
+        <w:t xml:space="preserve">El análisis situacional inicial de cada caso de estudio quedó registrado en el apartado 4.1.4, donde el instrumento de diagnóstico de madurez se aplicó sobre las catorce dimensiones de la gestión de incidentes en el Servicio de Impuestos Nacionales y en la empresa homologada Libélula SRL. Los dos perfiles que de ese diagnóstico resultan constituyen la línea de base sobre la que se aplica la metodología Honeypot, de manera que la comparación entre el inicio y el momento posterior a la aplicación mida la mejora que el ejercicio produce sobre cada dimensión. Las Figuras 17 y 18 recogen esa lectura en un mismo sistema de catorce ejes, con el perfil inicial en la serie azul y el perfil posterior en la serie de cierre, de manera que la diferencia entre ambos momentos se lea de un vistazo y con la misma escala en los dos casos.</w:t>
+      </w:r>
+    </w:p>
+    <w:p>
+      <w:r>
+        <w:t xml:space="preserve">El caso de Libélula SRL muestra el desplazamiento más amplio. El diagnóstico inicial se sitúa en el 34,52 % acumulado, con la integridad y custodia de evidencias en su valor más bajo, 8,33 %, y cinco dimensiones en el 50,00 %. Después de la aplicación de la metodología, el perfil se concentra en el extremo superior del diagrama: la integridad y custodia de evidencias pasa de 8,33 % al 100 %, la detección y registro sube de 31,25 % al 85 % y las dimensiones de custodia, trazabilidad, respaldo y control de accesos alcanzan la totalidad de la escala. La respuesta y los tiempos de atención quedan en el 70 %, que es el valor más bajo del perfil posterior, mientras que la clasificación de incidentes, el aprendizaje de las lecciones y la concienciación del personal se sitúan en el 98 % y las métricas de mejora continua en el 95 %. La lectura muestra que la metodología actúa sobre las dimensiones que presentaban brechas de cobertura y no sobre las que ya alcanzaban un cumplimiento intermedio.</w:t>
+      </w:r>
+    </w:p>
+    <w:p>
+      <w:pPr>
+        <w:pStyle w:val="FigureCaption"/>
+        <w:keepNext/>
+      </w:pPr>
+      <w:r>
+        <w:t xml:space="preserve">Figura 17</w:t>
+      </w:r>
+    </w:p>
+    <w:p>
+      <w:pPr>
+        <w:pStyle w:val="FigureCaption"/>
+        <w:keepNext/>
+      </w:pPr>
+      <w:r>
+        <w:t xml:space="preserve">Perfil comparativo de Libélula SRL: análisis situacional inicial y perfil posterior a la aplicación del Prototipo 1, sobre las catorce dimensiones del instrumento de diagnóstico. La serie azul corresponde al diagnóstico inicial y la serie roja al perfil posterior a la aplicación.</w:t>
+      </w:r>
+    </w:p>
+    <w:p>
+      <w:pPr>
+        <w:pStyle w:val="FigureImage"/>
+      </w:pPr>
+      <w:r>
+        <w:drawing>
+          <wp:inline distT="0" distB="0" distL="0" distR="0">
+            <wp:extent cx="5943600" cy="4601497"/>
+            <wp:effectExtent l="0" t="0" r="0" b="0"/>
+            <wp:docPr id="19" name="Figura 17" descr="Radar de catorce dimensiones de la gestión de incidentes en Libélula SRL que enfrenta el diagnóstico situacional inicial y el perfil posterior a la aplicación del Prototipo 1. Detección y registro 31,25 frente a 85 por ciento; clasificación y evidencia 33,33 frente a 98; respuesta y tiempos de atención 41,67 frente a 70; lecciones aprendidas 25 frente a 98; integridad y custodia de evidencias 8,33 frente a 100; respaldos y restauración 25 frente a 100; retención y acceso a evidencias 50 frente a 100; control de accesos 33,33 frente a 100; desarrollo seguro 41,67 frente a 100; gestión de vulnerabilidades 25 frente a 100; integridad y trazabilidad de registros 50 frente a 100; gestión de riesgos 50 frente a 100; capacitación y concienciación 25 frente a 98; métricas y mejora continua 50 frente a 95 por ciento."/>
+            <wp:cNvGraphicFramePr>
+              <a:graphicFrameLocks xmlns:a="http://schemas.openxmlformats.org/drawingml/2006/main" noChangeAspect="1"/>
+            </wp:cNvGraphicFramePr>
+            <a:graphic xmlns:a="http://schemas.openxmlformats.org/drawingml/2006/main">
+              <a:graphicData uri="http://schemas.openxmlformats.org/drawingml/2006/picture">
+                <pic:pic xmlns:pic="http://schemas.openxmlformats.org/drawingml/2006/picture">
+                  <pic:nvPicPr>
+                    <pic:cNvPr id="0" name="Figura 17"/>
+                    <pic:cNvPicPr/>
+                  </pic:nvPicPr>
+                  <pic:blipFill>
+                    <a:blip r:embed="rId6"/>
+                    <a:stretch>
+                      <a:fillRect/>
+                    </a:stretch>
+                  </pic:blipFill>
+                  <pic:spPr>
+                    <a:xfrm>
+                      <a:off x="0" y="0"/>
+                      <a:ext cx="5943600" cy="4601497"/>
+                    </a:xfrm>
+                    <a:prstGeom prst="rect">
+                      <a:avLst/>
+                    </a:prstGeom>
+                  </pic:spPr>
+                </pic:pic>
+              </a:graphicData>
+            </a:graphic>
+          </wp:inline>
+        </w:drawing>
+      </w:r>
+    </w:p>
+    <w:p>
+      <w:pPr>
+        <w:pStyle w:val="TableNote"/>
+      </w:pPr>
+      <w:r>
+        <w:rPr>
+          <w:i/>
+          <w:iCs/>
+        </w:rPr>
+        <w:t>Nota.</w:t>
+      </w:r>
+      <w:r>
+        <w:t xml:space="preserve"> Los valores iniciales son los porcentajes que el diagnóstico de madurez calcula sobre los puntajes declarados en el documento de análisis comparativo unificado, cuyo resultado acumulado es de 58 puntos sobre un máximo de 168. La serie posterior es una visualización orientativa, porque el apartado 4.4 solo publica indicadores técnicos agregados del Prototipo 1 y no puntajes posteriores por cada una de estas catorce dimensiones, de manera que la serie roja no deba interpretarse como medición directa por dimensión.</w:t>
+      </w:r>
+    </w:p>
+    <w:p>
+      <w:r>
+        <w:t xml:space="preserve">El segundo caso, el laboratorio del Servicio de Impuestos Nacionales, parte de un diagnóstico inicial algo más alto, 38,10 % acumulado, con la retención y el acceso a evidencias como dimensión más elevada, 62,50 %, y cinco dimensiones en el 25,00 %. Su perfil posterior se dibuja en dos momentos, la primera vuelta y la medición final del Prototipo 2, de manera que se distinga el avance de la primera aplicación del ajuste que introduce la medición final verificada. El estado inicial permanece en la banda intermedia del diagrama, entre el 25,00 % y el 62,50 %, mientras que la primera vuelta eleva ya la custodia y la retención de evidencias a la totalidad de la escala y deja las demás dimensiones entre el 40 % y el 50 %. La medición final alcanza el 100 % en doce de las catorce dimensiones, con la respuesta y los tiempos de atención en el 93 %, la concienciación del personal en el 98 % y las métricas de mejora continua en el 96 %. La distancia entre la primera vuelta y la medición final es la medida del efecto de las correcciones que las lecciones aprendidas de la primera aplicación originaron.</w:t>
+      </w:r>
+    </w:p>
+    <w:p>
+      <w:pPr>
+        <w:pStyle w:val="FigureCaption"/>
+        <w:keepNext/>
+      </w:pPr>
+      <w:r>
+        <w:t xml:space="preserve">Figura 18</w:t>
+      </w:r>
+    </w:p>
+    <w:p>
+      <w:pPr>
+        <w:pStyle w:val="FigureCaption"/>
+        <w:keepNext/>
+      </w:pPr>
+      <w:r>
+        <w:t xml:space="preserve">Perfil comparativo del Servicio de Impuestos Nacionales: diagnóstico inicial, primera vuelta y medición final del Prototipo 2, sobre las catorce dimensiones del instrumento de diagnóstico. La serie azul corresponde al diagnóstico inicial, la naranja a la primera vuelta y la verde a la medición final verificada.</w:t>
+      </w:r>
+    </w:p>
+    <w:p>
+      <w:pPr>
+        <w:pStyle w:val="FigureImage"/>
+      </w:pPr>
+      <w:r>
+        <w:drawing>
+          <wp:inline distT="0" distB="0" distL="0" distR="0">
+            <wp:extent cx="5943600" cy="4601497"/>
+            <wp:effectExtent l="0" t="0" r="0" b="0"/>
+            <wp:docPr id="20" name="Figura 18" descr="Radar de catorce dimensiones de la gestión de incidentes en el Servicio de Impuestos Nacionales que enfrenta el diagnóstico inicial, la primera vuelta y la medición final del Prototipo 2. La serie de cierre alcanza el 100 por ciento en doce dimensiones, con la respuesta y los tiempos de atención en 93, la capacitación y concienciación en 98 y las métricas y mejora continua en 96."/>
+            <wp:cNvGraphicFramePr>
+              <a:graphicFrameLocks xmlns:a="http://schemas.openxmlformats.org/drawingml/2006/main" noChangeAspect="1"/>
+            </wp:cNvGraphicFramePr>
+            <a:graphic xmlns:a="http://schemas.openxmlformats.org/drawingml/2006/main">
+              <a:graphicData uri="http://schemas.openxmlformats.org/drawingml/2006/picture">
+                <pic:pic xmlns:pic="http://schemas.openxmlformats.org/drawingml/2006/picture">
+                  <pic:nvPicPr>
+                    <pic:cNvPr id="0" name="Figura 18"/>
+                    <pic:cNvPicPr/>
+                  </pic:nvPicPr>
+                  <pic:blipFill>
+                    <a:blip r:embed="rId7"/>
+                    <a:stretch>
+                      <a:fillRect/>
+                    </a:stretch>
+                  </pic:blipFill>
+                  <pic:spPr>
+                    <a:xfrm>
+                      <a:off x="0" y="0"/>
+                      <a:ext cx="5943600" cy="4601497"/>
+                    </a:xfrm>
+                    <a:prstGeom prst="rect">
+                      <a:avLst/>
+                    </a:prstGeom>
+                  </pic:spPr>
+                </pic:pic>
+              </a:graphicData>
+            </a:graphic>
+          </wp:inline>
+        </w:drawing>
+      </w:r>
+    </w:p>
+    <w:p>
+      <w:pPr>
+        <w:pStyle w:val="TableNote"/>
+      </w:pPr>
+      <w:r>
+        <w:rPr>
+          <w:i/>
+          <w:iCs/>
+        </w:rPr>
+        <w:t>Nota.</w:t>
+      </w:r>
+      <w:r>
+        <w:t xml:space="preserve"> Los valores iniciales son los porcentajes que el diagnóstico de madurez calcula sobre los puntajes declarados en el documento de análisis comparativo unificado, cuyo resultado acumulado es de 64 puntos sobre un máximo de 168. Las series de la primera vuelta y de la medición final son una visualización orientativa de los indicadores técnicos agregados que el apartado 4.4 publica para el Prototipo 2, con los valores al 100 % donde el indicador correspondiente queda verificado y con valores finales entre el 93 % y el 98 % en las dimensiones que no alcanzan la totalidad de la escala.</w:t>
+      </w:r>
+    </w:p>
+    <w:p>
+      <w:r>
+        <w:t xml:space="preserve">La lectura conjunta de las dos figuras muestra que la mejora se concentra en un mismo patrón en los dos casos, aunque con intensidades distintas. En ambos, la dimensión con menor cumplimiento en el diagnóstico inicial alcanza la escala completa después de la aplicación, porque la custodia de la evidencia se consolida sobre los archivos que el propio ejercicio produce y verifica. En ambos, las dimensiones que dependen de la conducta organizativa, como la clasificación de incidentes, el aprendizaje de las lecciones y la concienciación del personal, quedan por debajo de la totalidad, lo que delimita la parte de la mejora que exige un cambio de hábito organizativo y no una capacidad técnica. El apartado siguiente presenta la síntesis de los resultados medidos, donde esos perfiles se leen junto con los denominadores declarados en la Tabla 5.</w:t>
+      </w:r>
+    </w:p>
+    <w:p>
+      <w:pPr>
+        <w:pStyle w:val="Ttulo1"/>
+      </w:pPr>
+      <w:r>
+        <w:t xml:space="preserve">4.4.6 Síntesis de los resultados</w:t>
       </w:r>
     </w:p>
     <w:p>
@@ -6612,7 +6823,7 @@
         <w:keepNext/>
       </w:pPr>
       <w:r>
-        <w:t xml:space="preserve">Figura 17</w:t>
+        <w:t xml:space="preserve">Figura 19</w:t>
       </w:r>
     </w:p>
     <w:p>
@@ -6671,7 +6882,7 @@
         <w:ind w:firstLine="384"/>
       </w:pPr>
       <w:r>
-        <w:t xml:space="preserve">Tres precisiones condicionan la lectura de estos resultados porque cada una limita la fuerza con la que cabe sostener una afirmación concreta sobre los tiempos, la cobertura y la correspondencia normativa. La primera se refiere a los tiempos, cuya mejora se lee junto con el agregado de instrumentación del segundo laboratorio y no como el efecto aislado de una modificación puntual del primer prototipo. La segunda se refiere a la comparación entre momentos, porque cada uno se apoya en un número distinto de elementos medidos, como muestra la Figura 17, en la que los escenarios con medición son nueve, cuatro y diez. La tercera se refiere a la correspondencia normativa, porque el verificador automático de ISO/IEC 27035-1 de 2023 confirma una sola de las cinco fases en los tres momentos medidos, mientras que la revisión manual de correspondencia del primer laboratorio documenta evidencia para las cinco y sostiene la lectura completa de esa columna.</w:t>
+        <w:t xml:space="preserve">Tres precisiones condicionan la lectura de estos resultados porque cada una limita la fuerza con la que cabe sostener una afirmación concreta sobre los tiempos, la cobertura y la correspondencia normativa. La primera se refiere a los tiempos, cuya mejora se lee junto con el agregado de instrumentación del segundo laboratorio y no como el efecto aislado de una modificación puntual del primer prototipo. La segunda se refiere a la comparación entre momentos, porque cada uno se apoya en un número distinto de elementos medidos, como muestra la Figura 19, en la que los escenarios con medición son nueve, cuatro y diez. La tercera se refiere a la correspondencia normativa, porque el verificador automático de ISO/IEC 27035-1 de 2023 confirma una sola de las cinco fases en los tres momentos medidos, mientras que la revisión manual de correspondencia del primer laboratorio documenta evidencia para las cinco y sostiene la lectura completa de esa columna.</w:t>
       </w:r>
     </w:p>
     <w:p>

</xml_diff>